<commit_message>
feat: Week 3 RAG integration - Richard's tasks complete
- RAG architecture diagram (docs/architecture/RAG_Architecture.png)
- Integrated Oscar's RAG module into app.py
- RAG retrieval for policy questions with source grounding
- Updated prompt to v3.0-rag
- All 15 RAG tests passing (15/15)
- Responses now show [Source: DOC-xx] citations
</commit_message>
<xml_diff>
--- a/docs/weekly-reports/Week2_04_Progress_Report.docx
+++ b/docs/weekly-reports/Week2_04_Progress_Report.docx
@@ -314,7 +314,7 @@
                 <w:b w:val="0"/>
                 <w:sz w:val="20"/>
               </w:rPr>
-              <w:t>Gemini 2.0 Flash (gemini-2.0-flash) — Prompt v2.0 — Tag week2-baseline</w:t>
+              <w:t>Gemini 2.0 Flash (gemini-3.6-flash) — Prompt v2.0 — Tag week2-baseline</w:t>
             </w:r>
           </w:p>
         </w:tc>
@@ -334,7 +334,7 @@
         <w:pStyle w:val="ListParagraph"/>
       </w:pPr>
       <w:r>
-        <w:t>Selected Gemini 2.0 Flash (gemini-2.0-flash) and documented capability, cost (0.10 USD/1M in, 0.40/1M out, free tier), latency (1–3 s) and privacy (synthetic-only) in the one-page Model Selection Note.</w:t>
+        <w:t>Selected Gemini 2.0 Flash (gemini-3.6-flash) and documented capability, cost (0.10 USD/1M in, 0.40/1M out, free tier), latency (1–3 s) and privacy (synthetic-only) in the one-page Model Selection Note.</w:t>
       </w:r>
     </w:p>
     <w:p>

</xml_diff>